<commit_message>
Étape 3 : passage « Cette énergie résiduelle, on la contrôle aussi… » retiré (FR et EN)
script-v3.json, script-v2-en.json et scripts Word ; gen-a.mjs : encadrés de la voix v2/v3 activés par les 7 questions, encadré de
l'étape 3 seulement si synchro.json lui donne une phrase ; assembler.py : réplique raccourcie reprise de l'ancien audio ;
A/pauses-v6.json (sans la pause de 7.4, pause avant « Pourquoi fermées ? »).

Co-Authored-By: Claude Opus 5.5 <noreply@anthropic.com>
Claude-Session: https://claude.ai/code/session_016YnqtNNUyZYY3JuA5BfKCG
</commit_message>
<xml_diff>
--- a/video/Script_PRO-OP-DD-005_EN.docx
+++ b/video/Script_PRO-OP-DD-005_EN.docx
@@ -539,24 +539,7 @@
         <w:rPr>
           <w:rFonts w:ascii="Arial" w:cs="Arial" w:eastAsia="Arial" w:hAnsi="Arial"/>
         </w:rPr>
-        <w:t xml:space="preserve"> but the springs are still pushing. </w:t>
-      </w:r>
-      <w:r>
-        <w:rPr>
-          <w:rFonts w:ascii="Arial" w:cs="Arial" w:eastAsia="Arial" w:hAnsi="Arial"/>
-          <w:i/>
-          <w:iCs/>
-          <w:color w:val="7B3FA0"/>
-          <w:sz w:val="20"/>
-          <w:szCs w:val="20"/>
-        </w:rPr>
-        <w:t xml:space="preserve">[calm]</w:t>
-      </w:r>
-      <w:r>
-        <w:rPr>
-          <w:rFonts w:ascii="Arial" w:cs="Arial" w:eastAsia="Arial" w:hAnsi="Arial"/>
-        </w:rPr>
-        <w:t xml:space="preserve"> We control that residual energy too: in step six, the three long bolts, put back without the bushing, hold the cone. In step seven, we loosen the other six bolts one turn at a time, and the springs ease off slowly.</w:t>
+        <w:t xml:space="preserve"> but the springs are still pushing.</w:t>
       </w:r>
     </w:p>
     <w:p>

</xml_diff>

<commit_message>
Vidéo 1 : étape 3 sans le passage sur les étapes 6 et 7 (voix et encadré), 5 min 40 s ; scripts FR et EN à jour
Script FR : passage barré à l'étape 3, temps recalés sur la vidéo en ligne. Script EN : séquence
« How the chuck works » (5 répliques) avant l'étape 1.

Co-Authored-By: Claude Opus 5.5 <noreply@anthropic.com>
Claude-Session: https://claude.ai/code/session_016YnqtNNUyZYY3JuA5BfKCG
</commit_message>
<xml_diff>
--- a/video/Script_PRO-OP-DD-005_EN.docx
+++ b/video/Script_PRO-OP-DD-005_EN.docx
@@ -242,6 +242,226 @@
           <w:rFonts w:ascii="Arial" w:cs="Arial" w:eastAsia="Arial" w:hAnsi="Arial"/>
         </w:rPr>
         <w:t xml:space="preserve"> Got it. Let's go through it step by step.</w:t>
+      </w:r>
+    </w:p>
+    <w:p>
+      <w:pPr>
+        <w:pStyle w:val="Heading2"/>
+        <w:spacing w:before="240" w:after="120"/>
+      </w:pPr>
+      <w:r>
+        <w:rPr>
+          <w:rFonts w:ascii="Arial" w:cs="Arial" w:eastAsia="Arial" w:hAnsi="Arial"/>
+        </w:rPr>
+        <w:t xml:space="preserve">How the chuck works (new sequence, before step 1)</w:t>
+      </w:r>
+    </w:p>
+    <w:p>
+      <w:pPr>
+        <w:pBdr>
+          <w:left w:val="dashed" w:color="B7791F" w:sz="24" w:space="6"/>
+        </w:pBdr>
+        <w:shd w:fill="FFF8E1" w:color="auto" w:val="clear"/>
+        <w:spacing w:before="60" w:after="140"/>
+        <w:ind w:left="120" w:right="120"/>
+      </w:pPr>
+      <w:r>
+        <w:rPr>
+          <w:rFonts w:ascii="Arial" w:cs="Arial" w:eastAsia="Arial" w:hAnsi="Arial"/>
+          <w:b/>
+          <w:bCs/>
+          <w:color w:val="8A5A00"/>
+        </w:rPr>
+        <w:t xml:space="preserve">NEW SEQUENCE — 20 s of the mechanism film:  </w:t>
+      </w:r>
+      <w:r>
+        <w:rPr>
+          <w:rFonts w:ascii="Arial" w:cs="Arial" w:eastAsia="Arial" w:hAnsi="Arial"/>
+          <w:i/>
+          <w:iCs/>
+          <w:color w:val="595959"/>
+        </w:rPr>
+        <w:t xml:space="preserve">0–5 s 360° view of the housing (“hides the whole mechanism”); 5–6.5 s glide to the cutaway; 6.6–12 s levers open, red screen, card “the lock changes nothing”; 12–16.4 s levers closed, green screen; 16.4–20 s “Before locking out: levers closed.”</w:t>
+      </w:r>
+    </w:p>
+    <w:p>
+      <w:pPr>
+        <w:pBdr>
+          <w:left w:val="single" w:color="1F4E79" w:sz="24" w:space="6"/>
+        </w:pBdr>
+        <w:shd w:fill="E9F1FA" w:color="auto" w:val="clear"/>
+        <w:spacing w:before="60" w:after="140"/>
+        <w:ind w:left="120" w:right="120"/>
+      </w:pPr>
+      <w:r>
+        <w:rPr>
+          <w:rFonts w:ascii="Arial" w:cs="Arial" w:eastAsia="Arial" w:hAnsi="Arial"/>
+          <w:b/>
+          <w:bCs/>
+          <w:color w:val="1F4E79"/>
+        </w:rPr>
+        <w:t xml:space="preserve">Trainer: </w:t>
+      </w:r>
+      <w:r>
+        <w:rPr>
+          <w:rFonts w:ascii="Arial" w:cs="Arial" w:eastAsia="Arial" w:hAnsi="Arial"/>
+          <w:i/>
+          <w:iCs/>
+          <w:color w:val="7B3FA0"/>
+          <w:sz w:val="20"/>
+          <w:szCs w:val="20"/>
+        </w:rPr>
+        <w:t xml:space="preserve">[calm]</w:t>
+      </w:r>
+      <w:r>
+        <w:rPr>
+          <w:rFonts w:ascii="Arial" w:cs="Arial" w:eastAsia="Arial" w:hAnsi="Arial"/>
+        </w:rPr>
+        <w:t xml:space="preserve"> Before we start, let's look at what's inside the chuck.</w:t>
+      </w:r>
+    </w:p>
+    <w:p>
+      <w:pPr>
+        <w:pBdr>
+          <w:left w:val="single" w:color="1F4E79" w:sz="24" w:space="6"/>
+        </w:pBdr>
+        <w:shd w:fill="E9F1FA" w:color="auto" w:val="clear"/>
+        <w:spacing w:before="60" w:after="140"/>
+        <w:ind w:left="120" w:right="120"/>
+      </w:pPr>
+      <w:r>
+        <w:rPr>
+          <w:rFonts w:ascii="Arial" w:cs="Arial" w:eastAsia="Arial" w:hAnsi="Arial"/>
+          <w:b/>
+          <w:bCs/>
+          <w:color w:val="1F4E79"/>
+        </w:rPr>
+        <w:t xml:space="preserve">Trainer: </w:t>
+      </w:r>
+      <w:r>
+        <w:rPr>
+          <w:rFonts w:ascii="Arial" w:cs="Arial" w:eastAsia="Arial" w:hAnsi="Arial"/>
+          <w:i/>
+          <w:iCs/>
+          <w:color w:val="7B3FA0"/>
+          <w:sz w:val="20"/>
+          <w:szCs w:val="20"/>
+        </w:rPr>
+        <w:t xml:space="preserve">[serious]</w:t>
+      </w:r>
+      <w:r>
+        <w:rPr>
+          <w:rFonts w:ascii="Arial" w:cs="Arial" w:eastAsia="Arial" w:hAnsi="Arial"/>
+        </w:rPr>
+        <w:t xml:space="preserve"> Levers open: the oil pushes the piston, which pulls the cone back. The springs get squeezed, and the jaws open.</w:t>
+      </w:r>
+    </w:p>
+    <w:p>
+      <w:pPr>
+        <w:pBdr>
+          <w:left w:val="single" w:color="1F4E79" w:sz="24" w:space="6"/>
+        </w:pBdr>
+        <w:shd w:fill="E9F1FA" w:color="auto" w:val="clear"/>
+        <w:spacing w:before="60" w:after="140"/>
+        <w:ind w:left="120" w:right="120"/>
+      </w:pPr>
+      <w:r>
+        <w:rPr>
+          <w:rFonts w:ascii="Arial" w:cs="Arial" w:eastAsia="Arial" w:hAnsi="Arial"/>
+          <w:b/>
+          <w:bCs/>
+          <w:color w:val="1F4E79"/>
+        </w:rPr>
+        <w:t xml:space="preserve">Trainer: </w:t>
+      </w:r>
+      <w:r>
+        <w:rPr>
+          <w:rFonts w:ascii="Arial" w:cs="Arial" w:eastAsia="Arial" w:hAnsi="Arial"/>
+          <w:i/>
+          <w:iCs/>
+          <w:color w:val="7B3FA0"/>
+          <w:sz w:val="20"/>
+          <w:szCs w:val="20"/>
+        </w:rPr>
+        <w:t xml:space="preserve">[calm]</w:t>
+      </w:r>
+      <w:r>
+        <w:rPr>
+          <w:rFonts w:ascii="Arial" w:cs="Arial" w:eastAsia="Arial" w:hAnsi="Arial"/>
+        </w:rPr>
+        <w:t xml:space="preserve"> Levers closed: the pressure drops. The springs push the cone forward, and its wedge closes the jaws on the rod.</w:t>
+      </w:r>
+    </w:p>
+    <w:p>
+      <w:pPr>
+        <w:pBdr>
+          <w:left w:val="single" w:color="C55A11" w:sz="24" w:space="6"/>
+        </w:pBdr>
+        <w:shd w:fill="FCE9DB" w:color="auto" w:val="clear"/>
+        <w:spacing w:before="60" w:after="140"/>
+        <w:ind w:left="120" w:right="120"/>
+      </w:pPr>
+      <w:r>
+        <w:rPr>
+          <w:rFonts w:ascii="Arial" w:cs="Arial" w:eastAsia="Arial" w:hAnsi="Arial"/>
+          <w:b/>
+          <w:bCs/>
+          <w:color w:val="C55A11"/>
+        </w:rPr>
+        <w:t xml:space="preserve">Worker: </w:t>
+      </w:r>
+      <w:r>
+        <w:rPr>
+          <w:rFonts w:ascii="Arial" w:cs="Arial" w:eastAsia="Arial" w:hAnsi="Arial"/>
+          <w:i/>
+          <w:iCs/>
+          <w:color w:val="7B3FA0"/>
+          <w:sz w:val="20"/>
+          <w:szCs w:val="20"/>
+        </w:rPr>
+        <w:t xml:space="preserve">[curious]</w:t>
+      </w:r>
+      <w:r>
+        <w:rPr>
+          <w:rFonts w:ascii="Arial" w:cs="Arial" w:eastAsia="Arial" w:hAnsi="Arial"/>
+        </w:rPr>
+        <w:t xml:space="preserve"> So the springs are pushing all the time?</w:t>
+      </w:r>
+    </w:p>
+    <w:p>
+      <w:pPr>
+        <w:pBdr>
+          <w:left w:val="single" w:color="1F4E79" w:sz="24" w:space="6"/>
+        </w:pBdr>
+        <w:shd w:fill="E9F1FA" w:color="auto" w:val="clear"/>
+        <w:spacing w:before="60" w:after="140"/>
+        <w:ind w:left="120" w:right="120"/>
+      </w:pPr>
+      <w:r>
+        <w:rPr>
+          <w:rFonts w:ascii="Arial" w:cs="Arial" w:eastAsia="Arial" w:hAnsi="Arial"/>
+          <w:b/>
+          <w:bCs/>
+          <w:color w:val="1F4E79"/>
+        </w:rPr>
+        <w:t xml:space="preserve">Trainer: </w:t>
+      </w:r>
+      <w:r>
+        <w:rPr>
+          <w:rFonts w:ascii="Arial" w:cs="Arial" w:eastAsia="Arial" w:hAnsi="Arial"/>
+          <w:i/>
+          <w:iCs/>
+          <w:color w:val="7B3FA0"/>
+          <w:sz w:val="20"/>
+          <w:szCs w:val="20"/>
+        </w:rPr>
+        <w:t xml:space="preserve">[serious]</w:t>
+      </w:r>
+      <w:r>
+        <w:rPr>
+          <w:rFonts w:ascii="Arial" w:cs="Arial" w:eastAsia="Arial" w:hAnsi="Arial"/>
+        </w:rPr>
+        <w:t xml:space="preserve"> All the time. And from the outside, you can't see a thing: it's all hidden in the housing.</w:t>
       </w:r>
     </w:p>
     <w:p>

</xml_diff>

<commit_message>
Scripts FR et EN : séquence de remontage (procédure, points 10 à 13) et encadré de l'étape 1 (manettes ouvertes)
Co-Authored-By: Claude Opus 5.5 <noreply@anthropic.com>
Claude-Session: https://claude.ai/code/session_016YnqtNNUyZYY3JuA5BfKCG
</commit_message>
<xml_diff>
--- a/video/Script_PRO-OP-DD-005_EN.docx
+++ b/video/Script_PRO-OP-DD-005_EN.docx
@@ -566,6 +566,34 @@
     <w:p>
       <w:pPr>
         <w:pBdr>
+          <w:left w:val="dashed" w:color="B7791F" w:sz="24" w:space="6"/>
+        </w:pBdr>
+        <w:shd w:fill="FFF8E1" w:color="auto" w:val="clear"/>
+        <w:spacing w:before="60" w:after="140"/>
+        <w:ind w:left="120" w:right="120"/>
+      </w:pPr>
+      <w:r>
+        <w:rPr>
+          <w:rFonts w:ascii="Arial" w:cs="Arial" w:eastAsia="Arial" w:hAnsi="Arial"/>
+          <w:b/>
+          <w:bCs/>
+          <w:color w:val="8A5A00"/>
+        </w:rPr>
+        <w:t xml:space="preserve">“WHY” BOX — step 1 (replaced):  </w:t>
+      </w:r>
+      <w:r>
+        <w:rPr>
+          <w:rFonts w:ascii="Arial" w:cs="Arial" w:eastAsia="Arial" w:hAnsi="Arial"/>
+          <w:i/>
+          <w:iCs/>
+          <w:color w:val="595959"/>
+        </w:rPr>
+        <w:t xml:space="preserve">“Levers open: the springs are squeezed to the max, and the lock changes nothing. Closed: springs stretched to the max (procedure, point 1).”</w:t>
+      </w:r>
+    </w:p>
+    <w:p>
+      <w:pPr>
+        <w:pBdr>
           <w:left w:val="single" w:color="1F4E79" w:sz="24" w:space="6"/>
         </w:pBdr>
         <w:shd w:fill="E9F1FA" w:color="auto" w:val="clear"/>
@@ -1314,6 +1342,190 @@
           <w:rFonts w:ascii="Arial" w:cs="Arial" w:eastAsia="Arial" w:hAnsi="Arial"/>
         </w:rPr>
         <w:t xml:space="preserve"> Step nine: we take out the cone, the bowl, and the jaws, and we change the parts. The residual energy was released slowly: the cone stayed held the whole time.</w:t>
+      </w:r>
+    </w:p>
+    <w:p>
+      <w:pPr>
+        <w:pStyle w:val="Heading2"/>
+        <w:spacing w:before="240" w:after="120"/>
+      </w:pPr>
+      <w:r>
+        <w:rPr>
+          <w:rFonts w:ascii="Arial" w:cs="Arial" w:eastAsia="Arial" w:hAnsi="Arial"/>
+        </w:rPr>
+        <w:t xml:space="preserve">Reassembly (new sequence, procedure points 10 to 13)</w:t>
+      </w:r>
+    </w:p>
+    <w:p>
+      <w:pPr>
+        <w:pBdr>
+          <w:left w:val="dashed" w:color="B7791F" w:sz="24" w:space="6"/>
+        </w:pBdr>
+        <w:shd w:fill="FFF8E1" w:color="auto" w:val="clear"/>
+        <w:spacing w:before="60" w:after="140"/>
+        <w:ind w:left="120" w:right="120"/>
+      </w:pPr>
+      <w:r>
+        <w:rPr>
+          <w:rFonts w:ascii="Arial" w:cs="Arial" w:eastAsia="Arial" w:hAnsi="Arial"/>
+          <w:b/>
+          <w:bCs/>
+          <w:color w:val="8A5A00"/>
+        </w:rPr>
+        <w:t xml:space="preserve">NEW SEQUENCE — reassembly:  </w:t>
+      </w:r>
+      <w:r>
+        <w:rPr>
+          <w:rFonts w:ascii="Arial" w:cs="Arial" w:eastAsia="Arial" w:hAnsi="Arial"/>
+          <w:i/>
+          <w:iCs/>
+          <w:color w:val="595959"/>
+        </w:rPr>
+        <w:t xml:space="preserve">3D: cover cleaned, cone put back, the 3 long bolts first, then the other 6 tightened in the step-7 order 1 to 6 with the turn counter (one turn at a time); cards “3 long bolts first”, “9 new bolts ½ × 2 ¼” and “Torque wrench: 105 lb-ft”.</w:t>
+      </w:r>
+    </w:p>
+    <w:p>
+      <w:pPr>
+        <w:pBdr>
+          <w:left w:val="single" w:color="1F4E79" w:sz="24" w:space="6"/>
+        </w:pBdr>
+        <w:shd w:fill="E9F1FA" w:color="auto" w:val="clear"/>
+        <w:spacing w:before="60" w:after="140"/>
+        <w:ind w:left="120" w:right="120"/>
+      </w:pPr>
+      <w:r>
+        <w:rPr>
+          <w:rFonts w:ascii="Arial" w:cs="Arial" w:eastAsia="Arial" w:hAnsi="Arial"/>
+          <w:b/>
+          <w:bCs/>
+          <w:color w:val="1F4E79"/>
+        </w:rPr>
+        <w:t xml:space="preserve">Trainer: </w:t>
+      </w:r>
+      <w:r>
+        <w:rPr>
+          <w:rFonts w:ascii="Arial" w:cs="Arial" w:eastAsia="Arial" w:hAnsi="Arial"/>
+          <w:i/>
+          <w:iCs/>
+          <w:color w:val="7B3FA0"/>
+          <w:sz w:val="20"/>
+          <w:szCs w:val="20"/>
+        </w:rPr>
+        <w:t xml:space="preserve">[calm]</w:t>
+      </w:r>
+      <w:r>
+        <w:rPr>
+          <w:rFonts w:ascii="Arial" w:cs="Arial" w:eastAsia="Arial" w:hAnsi="Arial"/>
+        </w:rPr>
+        <w:t xml:space="preserve"> For reassembly, clean both sides of the cover well before putting it back.</w:t>
+      </w:r>
+    </w:p>
+    <w:p>
+      <w:pPr>
+        <w:pBdr>
+          <w:left w:val="single" w:color="1F4E79" w:sz="24" w:space="6"/>
+        </w:pBdr>
+        <w:shd w:fill="E9F1FA" w:color="auto" w:val="clear"/>
+        <w:spacing w:before="60" w:after="140"/>
+        <w:ind w:left="120" w:right="120"/>
+      </w:pPr>
+      <w:r>
+        <w:rPr>
+          <w:rFonts w:ascii="Arial" w:cs="Arial" w:eastAsia="Arial" w:hAnsi="Arial"/>
+          <w:b/>
+          <w:bCs/>
+          <w:color w:val="1F4E79"/>
+        </w:rPr>
+        <w:t xml:space="preserve">Trainer: </w:t>
+      </w:r>
+      <w:r>
+        <w:rPr>
+          <w:rFonts w:ascii="Arial" w:cs="Arial" w:eastAsia="Arial" w:hAnsi="Arial"/>
+          <w:i/>
+          <w:iCs/>
+          <w:color w:val="7B3FA0"/>
+          <w:sz w:val="20"/>
+          <w:szCs w:val="20"/>
+        </w:rPr>
+        <w:t xml:space="preserve">[serious]</w:t>
+      </w:r>
+      <w:r>
+        <w:rPr>
+          <w:rFonts w:ascii="Arial" w:cs="Arial" w:eastAsia="Arial" w:hAnsi="Arial"/>
+        </w:rPr>
+        <w:t xml:space="preserve"> To put the piston back, first reinstall the three long bolts. Then tighten the other six in the step-seven order, one turn at a time, so you don't crush the springs on one side only.</w:t>
+      </w:r>
+    </w:p>
+    <w:p>
+      <w:pPr>
+        <w:pBdr>
+          <w:left w:val="single" w:color="C55A11" w:sz="24" w:space="6"/>
+        </w:pBdr>
+        <w:shd w:fill="FCE9DB" w:color="auto" w:val="clear"/>
+        <w:spacing w:before="60" w:after="140"/>
+        <w:ind w:left="120" w:right="120"/>
+      </w:pPr>
+      <w:r>
+        <w:rPr>
+          <w:rFonts w:ascii="Arial" w:cs="Arial" w:eastAsia="Arial" w:hAnsi="Arial"/>
+          <w:b/>
+          <w:bCs/>
+          <w:color w:val="C55A11"/>
+        </w:rPr>
+        <w:t xml:space="preserve">Worker: </w:t>
+      </w:r>
+      <w:r>
+        <w:rPr>
+          <w:rFonts w:ascii="Arial" w:cs="Arial" w:eastAsia="Arial" w:hAnsi="Arial"/>
+          <w:i/>
+          <w:iCs/>
+          <w:color w:val="7B3FA0"/>
+          <w:sz w:val="20"/>
+          <w:szCs w:val="20"/>
+        </w:rPr>
+        <w:t xml:space="preserve">[curious]</w:t>
+      </w:r>
+      <w:r>
+        <w:rPr>
+          <w:rFonts w:ascii="Arial" w:cs="Arial" w:eastAsia="Arial" w:hAnsi="Arial"/>
+        </w:rPr>
+        <w:t xml:space="preserve"> Can we reuse the nine cover bolts?</w:t>
+      </w:r>
+    </w:p>
+    <w:p>
+      <w:pPr>
+        <w:pBdr>
+          <w:left w:val="single" w:color="1F4E79" w:sz="24" w:space="6"/>
+        </w:pBdr>
+        <w:shd w:fill="E9F1FA" w:color="auto" w:val="clear"/>
+        <w:spacing w:before="60" w:after="140"/>
+        <w:ind w:left="120" w:right="120"/>
+      </w:pPr>
+      <w:r>
+        <w:rPr>
+          <w:rFonts w:ascii="Arial" w:cs="Arial" w:eastAsia="Arial" w:hAnsi="Arial"/>
+          <w:b/>
+          <w:bCs/>
+          <w:color w:val="1F4E79"/>
+        </w:rPr>
+        <w:t xml:space="preserve">Trainer: </w:t>
+      </w:r>
+      <w:r>
+        <w:rPr>
+          <w:rFonts w:ascii="Arial" w:cs="Arial" w:eastAsia="Arial" w:hAnsi="Arial"/>
+          <w:i/>
+          <w:iCs/>
+          <w:color w:val="7B3FA0"/>
+          <w:sz w:val="20"/>
+          <w:szCs w:val="20"/>
+        </w:rPr>
+        <w:t xml:space="preserve">[confident]</w:t>
+      </w:r>
+      <w:r>
+        <w:rPr>
+          <w:rFonts w:ascii="Arial" w:cs="Arial" w:eastAsia="Arial" w:hAnsi="Arial"/>
+        </w:rPr>
+        <w:t xml:space="preserve"> No. Once they're removed, you put in new ones, half-inch by two and a quarter. And you tighten them with the torque wrench, to a hundred and five foot-pounds.</w:t>
       </w:r>
     </w:p>
     <w:p>

</xml_diff>

<commit_message>
Scripts FR et EN : corrections de François (remontage) et nouvelle réplique « Ce qu'il faut garder en tête »
Co-Authored-By: Claude Opus 5.5 <noreply@anthropic.com>
Claude-Session: https://claude.ai/code/session_016YnqtNNUyZYY3JuA5BfKCG
</commit_message>
<xml_diff>
--- a/video/Script_PRO-OP-DD-005_EN.docx
+++ b/video/Script_PRO-OP-DD-005_EN.docx
@@ -1453,7 +1453,7 @@
         <w:rPr>
           <w:rFonts w:ascii="Arial" w:cs="Arial" w:eastAsia="Arial" w:hAnsi="Arial"/>
         </w:rPr>
-        <w:t xml:space="preserve"> To put the piston back, first reinstall the three long bolts. Then tighten the other six in the step-seven order, one turn at a time, so you don't crush the springs on one side only.</w:t>
+        <w:t xml:space="preserve"> To put the piston back, first reinstall the three long bolts. Then tighten the other six in order, one turn at a time, so you don't crush the springs on one side only.</w:t>
       </w:r>
     </w:p>
     <w:p>
@@ -1525,7 +1525,7 @@
         <w:rPr>
           <w:rFonts w:ascii="Arial" w:cs="Arial" w:eastAsia="Arial" w:hAnsi="Arial"/>
         </w:rPr>
-        <w:t xml:space="preserve"> No. Once they're removed, you put in new ones, half-inch by two and a quarter. And you tighten them with the torque wrench, to a hundred and five foot-pounds.</w:t>
+        <w:t xml:space="preserve"> No. Once they're removed, you put in new ones. And you tighten them with the torque wrench, to a hundred and five foot-pounds.</w:t>
       </w:r>
     </w:p>
     <w:p>
@@ -1567,30 +1567,47 @@
           <w:sz w:val="20"/>
           <w:szCs w:val="20"/>
         </w:rPr>
-        <w:t xml:space="preserve">[confident]</w:t>
-      </w:r>
-      <w:r>
-        <w:rPr>
-          <w:rFonts w:ascii="Arial" w:cs="Arial" w:eastAsia="Arial" w:hAnsi="Arial"/>
-        </w:rPr>
-        <w:t xml:space="preserve"> For this shift: never take a cone bolt all the way out under load. The three long bolts without the bushing, before loosening the other six bolts. </w:t>
-      </w:r>
-      <w:r>
-        <w:rPr>
-          <w:rFonts w:ascii="Arial" w:cs="Arial" w:eastAsia="Arial" w:hAnsi="Arial"/>
-          <w:i/>
-          <w:iCs/>
-          <w:color w:val="7B3FA0"/>
-          <w:sz w:val="20"/>
-          <w:szCs w:val="20"/>
-        </w:rPr>
-        <w:t xml:space="preserve">[calm]</w:t>
-      </w:r>
-      <w:r>
-        <w:rPr>
-          <w:rFonts w:ascii="Arial" w:cs="Arial" w:eastAsia="Arial" w:hAnsi="Arial"/>
-        </w:rPr>
-        <w:t xml:space="preserve"> And one turn at a time.</w:t>
+        <w:t xml:space="preserve">[calm]</w:t>
+      </w:r>
+      <w:r>
+        <w:rPr>
+          <w:rFonts w:ascii="Arial" w:cs="Arial" w:eastAsia="Arial" w:hAnsi="Arial"/>
+        </w:rPr>
+        <w:t xml:space="preserve"> What to keep in mind: as long as the cone is bolted in, the springs are pushing on it. </w:t>
+      </w:r>
+      <w:r>
+        <w:rPr>
+          <w:rFonts w:ascii="Arial" w:cs="Arial" w:eastAsia="Arial" w:hAnsi="Arial"/>
+          <w:i/>
+          <w:iCs/>
+          <w:color w:val="7B3FA0"/>
+          <w:sz w:val="20"/>
+          <w:szCs w:val="20"/>
+        </w:rPr>
+        <w:t xml:space="preserve">[serious]</w:t>
+      </w:r>
+      <w:r>
+        <w:rPr>
+          <w:rFonts w:ascii="Arial" w:cs="Arial" w:eastAsia="Arial" w:hAnsi="Arial"/>
+        </w:rPr>
+        <w:t xml:space="preserve"> The three long bolts without bushings hold it, and you loosen the other six one turn at a time, in order. </w:t>
+      </w:r>
+      <w:r>
+        <w:rPr>
+          <w:rFonts w:ascii="Arial" w:cs="Arial" w:eastAsia="Arial" w:hAnsi="Arial"/>
+          <w:i/>
+          <w:iCs/>
+          <w:color w:val="7B3FA0"/>
+          <w:sz w:val="20"/>
+          <w:szCs w:val="20"/>
+        </w:rPr>
+        <w:t xml:space="preserve">[calm]</w:t>
+      </w:r>
+      <w:r>
+        <w:rPr>
+          <w:rFonts w:ascii="Arial" w:cs="Arial" w:eastAsia="Arial" w:hAnsi="Arial"/>
+        </w:rPr>
+        <w:t xml:space="preserve"> That's how the energy comes out slowly.</w:t>
       </w:r>
     </w:p>
     <w:p>

</xml_diff>

<commit_message>
Scripts FR et EN : « Pourquoi fermées ? » de l'étape 1 relié à la séquence du mécanisme (« On vient de le voir… Mais il en reste. »)
Co-Authored-By: Claude Opus 5.5 <noreply@anthropic.com>
Claude-Session: https://claude.ai/code/session_016YnqtNNUyZYY3JuA5BfKCG
</commit_message>
<xml_diff>
--- a/video/Script_PRO-OP-DD-005_EN.docx
+++ b/video/Script_PRO-OP-DD-005_EN.docx
@@ -543,24 +543,24 @@
         <w:rPr>
           <w:rFonts w:ascii="Arial" w:cs="Arial" w:eastAsia="Arial" w:hAnsi="Arial"/>
         </w:rPr>
-        <w:t xml:space="preserve"> In the open position, the hydraulics push the cylinder, and the springs are squeezed to the max. If you lock out like that, the lock changes nothing: all that energy stays trapped in the chuck. </w:t>
-      </w:r>
-      <w:r>
-        <w:rPr>
-          <w:rFonts w:ascii="Arial" w:cs="Arial" w:eastAsia="Arial" w:hAnsi="Arial"/>
-          <w:i/>
-          <w:iCs/>
-          <w:color w:val="7B3FA0"/>
-          <w:sz w:val="20"/>
-          <w:szCs w:val="20"/>
-        </w:rPr>
-        <w:t xml:space="preserve">[calm]</w:t>
-      </w:r>
-      <w:r>
-        <w:rPr>
-          <w:rFonts w:ascii="Arial" w:cs="Arial" w:eastAsia="Arial" w:hAnsi="Arial"/>
-        </w:rPr>
-        <w:t xml:space="preserve"> Closed, the springs are stretched to the max: that's where the least energy is left.</w:t>
+        <w:t xml:space="preserve"> We just saw it: open, the springs are squeezed to the max. If you lock out like that, the lock stops the hydraulics, but all the springs' energy stays trapped in the chuck. </w:t>
+      </w:r>
+      <w:r>
+        <w:rPr>
+          <w:rFonts w:ascii="Arial" w:cs="Arial" w:eastAsia="Arial" w:hAnsi="Arial"/>
+          <w:i/>
+          <w:iCs/>
+          <w:color w:val="7B3FA0"/>
+          <w:sz w:val="20"/>
+          <w:szCs w:val="20"/>
+        </w:rPr>
+        <w:t xml:space="preserve">[calm]</w:t>
+      </w:r>
+      <w:r>
+        <w:rPr>
+          <w:rFonts w:ascii="Arial" w:cs="Arial" w:eastAsia="Arial" w:hAnsi="Arial"/>
+        </w:rPr>
+        <w:t xml:space="preserve"> Closed, they're stretched to the max: that's where the least energy is left. But some is still there.</w:t>
       </w:r>
     </w:p>
     <w:p>

</xml_diff>